<commit_message>
v0.228 — a Integridade do inimigo vira metade da vida, e o Armado ganha espaco proprio
- A Integridade do inimigo passa a ser metade da vida maxima, arredondando
  para baixo: peca 24 SS3.3, peca 26 SS3, o manual (caixa, secao Inimigos e
  glossario), o gerador de inimigo e o livro do Bestiario. A decisao era da
  fase 1 do Bestiario (08/09) e nunca tinha atravessado.
- O 0,00 do Cisao na peca 16 continua: com a metade, o portador so termina a
  luta antes da vida se fizer mais de um terco do dano do grupo, e na mesa
  padrao de quatro cada um faz um quarto.
- Checagem 13 do conferir-alma: a mesma fracao nos quatro lugares, e o terco,
  o 2,0x e a mesa do empate saindo dela (14 perturbacoes, 2 contra-provas).
- Armado: o gatilho nao pode ser um momento do proprio turno, e ele nao entra
  com a Restricao Carregar.
- Manual v7.31, bloco-de-inimigo, os dois PDFs do Bestiario e os quatro
  artefatos do livro regerados.

Co-Authored-By: Claude Opus 5 <noreply@anthropic.com>
</commit_message>
<xml_diff>
--- a/manual/Fundamento-MANUAL-v7.docx
+++ b/manual/Fundamento-MANUAL-v7.docx
@@ -70,7 +70,7 @@
           <w:sz w:val="20"/>
           <w:szCs w:val="20"/>
         </w:rPr>
-        <w:t xml:space="preserve">Níveis 1–20  ·  Faixa lendária 21–30  ·  Versão 7.30</w:t>
+        <w:t xml:space="preserve">Níveis 1–20  ·  Faixa lendária 21–30  ·  Versão 7.31</w:t>
       </w:r>
     </w:p>
     <w:p>
@@ -28978,7 +28978,7 @@
                 <w:sz w:val="19"/>
                 <w:szCs w:val="19"/>
               </w:rPr>
-              <w:t xml:space="preserve">Você gasta a ação e o PE do feitiço, e ele fica armado até o fim da cena. Na hora de armar, escolha um gatilho que a mesa consiga ver acontecer. Quando ele acontece, o feitiço sai sem gastar Reação, com alcance e alvo conferidos naquela hora. Um armado por vez. Se ele não sair, porque a cena acabou ou porque você armou outro, metade do PE volta. Não entra no mesmo feitiço que Reação.</w:t>
+              <w:t xml:space="preserve">Você gasta a ação e o PE do feitiço, e ele fica armado até o fim da cena. Na hora de armar, escolha um gatilho que a mesa consiga ver acontecer e que não seja um momento do seu próprio turno. Quando ele acontece, o feitiço sai sem gastar Reação, com alcance e alvo conferidos naquela hora. Um armado por vez. Se ele não sair, porque a cena acabou ou porque você armou outro, metade do PE volta. Não entra no mesmo feitiço que Reação nem com a Restrição Carregar.</w:t>
             </w:r>
           </w:p>
         </w:tc>
@@ -49294,14 +49294,14 @@
                 <w:sz w:val="20"/>
                 <w:szCs w:val="20"/>
               </w:rPr>
-              <w:t xml:space="preserve">Integridade = vida máxima.</w:t>
+              <w:t xml:space="preserve">Integridade = metade da vida máxima</w:t>
             </w:r>
             <w:r>
               <w:rPr>
                 <w:sz w:val="20"/>
                 <w:szCs w:val="20"/>
               </w:rPr>
-              <w:t xml:space="preserve"> É a vida da alma.</w:t>
+              <w:t xml:space="preserve">, arredondando para baixo. É a vida da alma.</w:t>
             </w:r>
           </w:p>
           <w:p>
@@ -51422,7 +51422,7 @@
         <w:t xml:space="preserve">Integridade.</w:t>
       </w:r>
       <w:r>
-        <w:t xml:space="preserve"> A do inimigo é a que a seção acima escreve: a vida máxima dele, então a coluna de vida serve para as duas barras. Anote as duas assim mesmo — o sistema em volta tem efeito que tira alma sem tirar vida, e é aí que os dois números se separam.</w:t>
+        <w:t xml:space="preserve"> A do inimigo é a que a seção acima escreve: metade da vida máxima dele, tirada da coluna de vida. Anote as duas: dano na alma desconta das duas no mesmo tanto, e o sistema em volta tem efeito que tira alma sem tirar vida.</w:t>
       </w:r>
     </w:p>
     <w:p>
@@ -55110,7 +55110,7 @@
                 <w:sz w:val="19"/>
                 <w:szCs w:val="19"/>
               </w:rPr>
-              <w:t xml:space="preserve">A vida da alma. Igual à vida máxima em inimigo; personagem tem fórmula própria, e o dono dela é o sistema em volta. Só volta com descanso longo ou com a Melhoria Remenda.</w:t>
+              <w:t xml:space="preserve">A vida da alma. Metade da vida máxima em inimigo; personagem tem fórmula própria, e o dono dela é o sistema em volta. Só volta com descanso longo ou com a Melhoria Remenda.</w:t>
             </w:r>
           </w:p>
         </w:tc>

</xml_diff>

<commit_message>
v0.246 — tres combinacoes de Restricao saiam de graca e agora nao entram: o Rapido nao entra com o Atrasar, e a Reacao nao entra com o Atrasar nem com o Parado, com a regua na peca 3 §4 e a checagem 6 do conferir-acao derivando os vetos dos recursos; o manual vai a v7.32 com o Levanta pondo de pe seja qual for a vida maxima; o capitulo 47 ganha a Reacao da Defesa sem Armadura, que a peca 11 tinha desde a v0.165; a nota da ficha de papel para de dizer que o escudo desliga a protecao; metade de maestria 1 vale 1; o Jorro ataca e empurra; e o paragrafo "Levantar quem caiu" sai do capitulo 45
Co-Authored-By: Claude Opus 5 <noreply@anthropic.com>
</commit_message>
<xml_diff>
--- a/manual/Fundamento-MANUAL-v7.docx
+++ b/manual/Fundamento-MANUAL-v7.docx
@@ -70,7 +70,7 @@
           <w:sz w:val="20"/>
           <w:szCs w:val="20"/>
         </w:rPr>
-        <w:t xml:space="preserve">Níveis 1–20  ·  Faixa lendária 21–30  ·  Versão 7.31</w:t>
+        <w:t xml:space="preserve">Níveis 1–20  ·  Faixa lendária 21–30  ·  Versão 7.32</w:t>
       </w:r>
     </w:p>
     <w:p>
@@ -28797,7 +28797,7 @@
                 <w:sz w:val="19"/>
                 <w:szCs w:val="19"/>
               </w:rPr>
-              <w:t xml:space="preserve">Custa Ação Bônus em vez de Ação Padrão. Não entra no mesmo feitiço que Reação.</w:t>
+              <w:t xml:space="preserve">Custa Ação Bônus em vez de Ação Padrão. Não entra no mesmo feitiço que Reação nem com a Restrição Atrasar.</w:t>
             </w:r>
           </w:p>
         </w:tc>
@@ -28889,7 +28889,7 @@
                 <w:sz w:val="19"/>
                 <w:szCs w:val="19"/>
               </w:rPr>
-              <w:t xml:space="preserve">Você conjura como Reação, a um gatilho que você declara quando monta o feitiço. Não entra no mesmo feitiço que Rápido nem que Armado.</w:t>
+              <w:t xml:space="preserve">Você conjura como Reação, a um gatilho que você declara quando monta o feitiço. Não entra no mesmo feitiço que Rápido nem que Armado, nem com as Restrições Atrasar e Parado.</w:t>
             </w:r>
           </w:p>
         </w:tc>
@@ -30415,7 +30415,7 @@
                 <w:sz w:val="19"/>
                 <w:szCs w:val="19"/>
               </w:rPr>
-              <w:t xml:space="preserve">Um aliado caído em 0 pontos de vida volta com 5 × Classe. Uma vez por cena.</w:t>
+              <w:t xml:space="preserve">Um aliado caído em 0 pontos de vida volta de pé com 5 × Classe, seja qual for a vida máxima dele. Uma vez por cena.</w:t>
             </w:r>
           </w:p>
         </w:tc>

</xml_diff>